<commit_message>
added github link to the report docx
</commit_message>
<xml_diff>
--- a/Assignment 1/Report Assignment 1.docx
+++ b/Assignment 1/Report Assignment 1.docx
@@ -66,6 +66,12 @@
           <w:lang w:val="en-US"/>
         </w:rPr>
         <w:t xml:space="preserve"> Link: </w:t>
+      </w:r>
+      <w:r>
+        <w:rPr>
+          <w:lang w:val="en-US"/>
+        </w:rPr>
+        <w:t>https://github.com/zhanssss/ADS-Assignments/tree/master/Assignment%201/assignment-1</w:t>
       </w:r>
     </w:p>
     <w:p>

</xml_diff>